<commit_message>
Translate GPU market report title to English
Changed only the document title (docx body + core.xml metadata) to English, per request; body content stays in Korean.

Co-Authored-By: Claude Sonnet 5 <noreply@anthropic.com>
</commit_message>
<xml_diff>
--- a/research/GPU_시장조사_보고서_2026.docx
+++ b/research/GPU_시장조사_보고서_2026.docx
@@ -7,7 +7,7 @@
 
 <file path=docProps\core.xml><?xml version="1.0" encoding="utf-8"?>
 <cp:coreProperties xmlns:cp="http://schemas.openxmlformats.org/package/2006/metadata/core-properties" xmlns:dc="http://purl.org/dc/elements/1.1/" xmlns:dcterms="http://purl.org/dc/terms/" xmlns:xsi="http://www.w3.org/2001/XMLSchema-instance">
-  <dc:title>GPU ?쒖옣議곗궗 蹂닿퀬??2026</dc:title>
+  <dc:title>Graphics Card (GPU) Market Research Report 2026</dc:title>
   <dc:creator>chunsik</dc:creator>
   <cp:lastModifiedBy>chunsik</cp:lastModifiedBy>
   <dcterms:created xsi:type="dcterms:W3CDTF">2026-08-03T00:00:00Z</dcterms:created>
@@ -27,7 +27,7 @@
           <w:b/>
           <w:sz w:val="36"/>
         </w:rPr>
-        <w:t xml:space="preserve">그래픽카드(GPU) 시장조사 보고서</w:t>
+        <w:t xml:space="preserve">Graphics Card (GPU) Market Research Report</w:t>
       </w:r>
     </w:p>
     <w:p>

</xml_diff>